<commit_message>
Fix install deps in app for PID tuning
</commit_message>
<xml_diff>
--- a/docs/Короткие_инструкции/docx/R3_Как_настроить_ПИД_регуляторы.docx
+++ b/docs/Короткие_инструкции/docx/R3_Как_настроить_ПИД_регуляторы.docx
@@ -313,6 +313,7 @@
     <w:p>
       <w:pPr>
         <w:numPr>
+          <w:ilvl w:val="0"/>
           <w:numId w:val="0"/>
         </w:numPr>
         <w:ind w:leftChars="0"/>
@@ -458,21 +459,13 @@
           <w:rFonts w:hint="default"/>
           <w:lang w:val="ru-RU"/>
         </w:rPr>
-        <w:t xml:space="preserve">Настраивайте робота не на весу, а на полигоне в движении. Так как робот тяжелый, оптимальные коэффициэнты ПИД-регулятора для робота на весу и стоящего на колёсах - будут различаться. Для такой настройки </w:t>
-      </w:r>
-      <w:bookmarkStart w:id="1" w:name="_GoBack"/>
-      <w:bookmarkEnd w:id="1"/>
-      <w:r>
-        <w:rPr>
-          <w:rFonts w:hint="default"/>
-          <w:lang w:val="ru-RU"/>
-        </w:rPr>
-        <w:t>нужен длинный провод.</w:t>
+        <w:t>Настраивайте робота не на весу, а на полигоне в движении. Так как робот тяжелый, оптимальные коэффициэнты ПИД-регулятора для робота на весу и стоящего на колёсах - будут различаться. Для такой настройки нужен длинный провод.</w:t>
       </w:r>
     </w:p>
     <w:p>
       <w:pPr>
         <w:numPr>
+          <w:ilvl w:val="0"/>
           <w:numId w:val="0"/>
         </w:numPr>
         <w:ind w:leftChars="0"/>
@@ -975,7 +968,16 @@
           <w:rFonts w:hint="default"/>
           <w:lang w:val="en-US"/>
         </w:rPr>
-        <w:t>pip install -r requirements.txt</w:t>
+        <w:t>pip install -r pip_</w:t>
+      </w:r>
+      <w:bookmarkStart w:id="1" w:name="_GoBack"/>
+      <w:bookmarkEnd w:id="1"/>
+      <w:r>
+        <w:rPr>
+          <w:rFonts w:hint="default"/>
+          <w:lang w:val="en-US"/>
+        </w:rPr>
+        <w:t>requirements.txt</w:t>
       </w:r>
     </w:p>
     <w:p>
@@ -1705,7 +1707,7 @@
 
 <file path=word/commentsExtended.xml><?xml version="1.0" encoding="utf-8"?>
 <w15:commentsEx xmlns:wpc="http://schemas.microsoft.com/office/word/2010/wordprocessingCanvas" xmlns:mc="http://schemas.openxmlformats.org/markup-compatibility/2006" xmlns:o="urn:schemas-microsoft-com:office:office" xmlns:r="http://schemas.openxmlformats.org/officeDocument/2006/relationships" xmlns:m="http://schemas.openxmlformats.org/officeDocument/2006/math" xmlns:v="urn:schemas-microsoft-com:vml" xmlns:wp14="http://schemas.microsoft.com/office/word/2010/wordprocessingDrawing" xmlns:wp="http://schemas.openxmlformats.org/drawingml/2006/wordprocessingDrawing" xmlns:w="http://schemas.openxmlformats.org/wordprocessingml/2006/main" xmlns:w14="http://schemas.microsoft.com/office/word/2010/wordml" xmlns:w15="http://schemas.microsoft.com/office/word/2012/wordml" xmlns:w10="urn:schemas-microsoft-com:office:word" xmlns:wpg="http://schemas.microsoft.com/office/word/2010/wordprocessingGroup" xmlns:wpi="http://schemas.microsoft.com/office/word/2010/wordprocessingInk" xmlns:wne="http://schemas.microsoft.com/office/word/2006/wordml" xmlns:wps="http://schemas.microsoft.com/office/word/2010/wordprocessingShape" xmlns:wpsCustomData="http://www.wps.cn/officeDocument/2013/wpsCustomData" mc:Ignorable="w14 w15 wp14">
-  <w15:commentEx w15:paraId="77EBDDE9" w15:done="0"/>
+  <w15:commentEx w15:paraId="FF97FAFA" w15:done="0"/>
 </w15:commentsEx>
 </file>
 

</xml_diff>